<commit_message>
Fix signature image placement to match approved layout
</commit_message>
<xml_diff>
--- a/assets/leave-form-template.docx
+++ b/assets/leave-form-template.docx
@@ -1436,49 +1436,11 @@
       </w:r>
       <w:r>
         <w:rPr>
-          <w:sz w:val="24"/>
-          <w:szCs w:val="24"/>
-        </w:rPr>
-        <w:t>{{SIGNATURE_IMAGE}}</w:t>
-      </w:r>
-      <w:r>
-        <w:rPr>
           <w:b/>
           <w:sz w:val="24"/>
           <w:szCs w:val="24"/>
         </w:rPr>
         <w:t xml:space="preserve">Date </w:t>
-      </w:r>
-    </w:p>
-    <w:p>
-      <w:pPr>
-        <w:pStyle w:val="NoSpacing"/>
-        <w:pBdr>
-          <w:top w:val="single" w:sz="4" w:space="1" w:color="auto"/>
-          <w:left w:val="single" w:sz="4" w:space="4" w:color="auto"/>
-          <w:bottom w:val="single" w:sz="4" w:space="1" w:color="auto"/>
-          <w:right w:val="single" w:sz="4" w:space="4" w:color="auto"/>
-        </w:pBdr>
-        <w:tabs>
-          <w:tab w:val="left" w:pos="720"/>
-          <w:tab w:val="left" w:pos="3690"/>
-        </w:tabs>
-        <w:spacing w:line="276" w:lineRule="auto"/>
-        <w:rPr>
-          <w:bCs/>
-          <w:noProof/>
-          <w:sz w:val="24"/>
-          <w:szCs w:val="24"/>
-        </w:rPr>
-      </w:pPr>
-      <w:r>
-        <w:rPr>
-          <w:b/>
-          <w:sz w:val="24"/>
-          <w:szCs w:val="24"/>
-        </w:rPr>
-        <w:tab/>
-        <w:tab/>
       </w:r>
       <w:sdt>
         <w:sdtPr>
@@ -1511,6 +1473,35 @@
           </w:r>
         </w:sdtContent>
       </w:sdt>
+    </w:p>
+    <w:p>
+      <w:pPr>
+        <w:pStyle w:val="NoSpacing"/>
+        <w:pBdr>
+          <w:top w:val="single" w:sz="4" w:space="1" w:color="auto"/>
+          <w:left w:val="single" w:sz="4" w:space="4" w:color="auto"/>
+          <w:bottom w:val="single" w:sz="4" w:space="1" w:color="auto"/>
+          <w:right w:val="single" w:sz="4" w:space="4" w:color="auto"/>
+        </w:pBdr>
+        <w:tabs>
+          <w:tab w:val="left" w:pos="720"/>
+          <w:tab w:val="left" w:pos="3690"/>
+        </w:tabs>
+        <w:spacing w:line="276" w:lineRule="auto"/>
+        <w:rPr>
+          <w:bCs/>
+          <w:noProof/>
+          <w:sz w:val="24"/>
+          <w:szCs w:val="24"/>
+        </w:rPr>
+      </w:pPr>
+      <w:r>
+        <w:rPr>
+          <w:sz w:val="24"/>
+          <w:szCs w:val="24"/>
+        </w:rPr>
+        <w:t>{{SIGNATURE_IMAGE}}</w:t>
+      </w:r>
     </w:p>
     <w:p>
       <w:pPr>

</xml_diff>

<commit_message>
Fix reason/address placement and enlarge signature in exported template
</commit_message>
<xml_diff>
--- a/assets/leave-form-template.docx
+++ b/assets/leave-form-template.docx
@@ -993,6 +993,13 @@
         <w:tab/>
         <w:tab/>
       </w:r>
+      <w:r>
+        <w:rPr>
+          <w:sz w:val="24"/>
+          <w:szCs w:val="24"/>
+        </w:rPr>
+        <w:t>{{REASON}}</w:t>
+      </w:r>
     </w:p>
     <w:p>
       <w:pPr>
@@ -1089,13 +1096,6 @@
         <w:tab/>
         <w:tab/>
       </w:r>
-      <w:r>
-        <w:rPr>
-          <w:sz w:val="24"/>
-          <w:szCs w:val="24"/>
-        </w:rPr>
-        <w:t>{{REASON}}</w:t>
-      </w:r>
     </w:p>
     <w:p>
       <w:pPr>
@@ -1194,7 +1194,14 @@
           <w:szCs w:val="24"/>
         </w:rPr>
         <w:tab/>
-        <w:t xml:space="preserve">            </w:t>
+        <w:tab/>
+      </w:r>
+      <w:r>
+        <w:rPr>
+          <w:sz w:val="24"/>
+          <w:szCs w:val="24"/>
+        </w:rPr>
+        <w:t>{{ADDRESS}}</w:t>
       </w:r>
     </w:p>
     <w:p>
@@ -1290,13 +1297,6 @@
         <w:tab/>
         <w:tab/>
         <w:tab/>
-      </w:r>
-      <w:r>
-        <w:rPr>
-          <w:sz w:val="24"/>
-          <w:szCs w:val="24"/>
-        </w:rPr>
-        <w:t>{{ADDRESS}}</w:t>
       </w:r>
     </w:p>
     <w:p>

</xml_diff>

<commit_message>
Fix date row text wrap that pushed admin table to page 3
</commit_message>
<xml_diff>
--- a/assets/leave-form-template.docx
+++ b/assets/leave-form-template.docx
@@ -250,7 +250,7 @@
         </w:rPr>
         <w:tab/>
         <w:tab/>
-        <w:t xml:space="preserve">             </w:t>
+        <w:t xml:space="preserve">    </w:t>
       </w:r>
       <w:r>
         <w:rPr>
@@ -467,7 +467,7 @@
         <w:tab/>
         <w:tab/>
         <w:tab/>
-        <w:t xml:space="preserve">             </w:t>
+        <w:t xml:space="preserve">    </w:t>
       </w:r>
       <w:r>
         <w:rPr>
@@ -664,7 +664,7 @@
         </w:rPr>
         <w:tab/>
         <w:tab/>
-        <w:t xml:space="preserve">             </w:t>
+        <w:t xml:space="preserve">    </w:t>
       </w:r>
       <w:r>
         <w:rPr>

</xml_diff>

<commit_message>
Adding Leave Form Templates (Updated-fix)
</commit_message>
<xml_diff>
--- a/assets/leave-form-template.docx
+++ b/assets/leave-form-template.docx
@@ -176,12 +176,12 @@
               <wp:anchor distT="4294967294" distB="4294967294" distL="114300" distR="114300" simplePos="0" relativeHeight="251656192" behindDoc="0" locked="0" layoutInCell="1" allowOverlap="1" wp14:anchorId="0B0CE4CE" wp14:editId="08B2675E">
                 <wp:simplePos x="0" y="0"/>
                 <wp:positionH relativeFrom="column">
-                  <wp:posOffset>2265680</wp:posOffset>
+                  <wp:posOffset>2375680</wp:posOffset>
                 </wp:positionH>
                 <wp:positionV relativeFrom="paragraph">
                   <wp:posOffset>162559</wp:posOffset>
                 </wp:positionV>
-                <wp:extent cx="3656965" cy="0"/>
+                <wp:extent cx="3546965" cy="0"/>
                 <wp:effectExtent l="0" t="0" r="635" b="0"/>
                 <wp:wrapNone/>
                 <wp:docPr id="16" name="Straight Arrow Connector 16"/>
@@ -197,7 +197,7 @@
                       <wps:spPr bwMode="auto">
                         <a:xfrm>
                           <a:off x="0" y="0"/>
-                          <a:ext cx="3656965" cy="0"/>
+                          <a:ext cx="3546965" cy="0"/>
                         </a:xfrm>
                         <a:prstGeom prst="straightConnector1">
                           <a:avLst/>
@@ -227,7 +227,7 @@
           </mc:Choice>
           <mc:Fallback xmlns:oel="http://schemas.microsoft.com/office/2019/extlst">
             <w:pict>
-              <v:shape w14:anchorId="498FEB96" id="Straight Arrow Connector 16" o:spid="_x0000_s1026" type="#_x0000_t32" style="position:absolute;margin-left:178.4pt;margin-top:12.8pt;width:287.95pt;height:0;z-index:251656192;visibility:visible;mso-wrap-style:square;mso-width-percent:0;mso-height-percent:0;mso-wrap-distance-left:9pt;mso-wrap-distance-top:.mm;mso-wrap-distance-right:9pt;mso-wrap-distance-bottom:.mm;mso-position-horizontal:absolute;mso-position-horizontal-relative:text;mso-position-vertical:absolute;mso-position-vertical-relative:text;mso-width-percent:0;mso-height-percent:0;mso-width-relative:page;mso-height-relative:page" o:gfxdata="UEsDBBQABgAIAAAAIQC2gziS/gAAAOEBAAATAAAAW0NvbnRlbnRfVHlwZXNdLnhtbJSRQU7DMBBF 90jcwfIWJU67QAgl6YK0S0CoHGBkTxKLZGx5TGhvj5O2G0SRWNoz/78nu9wcxkFMGNg6quQqL6RA 0s5Y6ir5vt9lD1JwBDIwOMJKHpHlpr69KfdHjyxSmriSfYz+USnWPY7AufNIadK6MEJMx9ApD/oD OlTrorhX2lFEilmcO2RdNtjC5xDF9pCuTyYBB5bi6bQ4syoJ3g9WQ0ymaiLzg5KdCXlKLjvcW893 SUOqXwnz5DrgnHtJTxOsQfEKIT7DmDSUCaxw7Rqn8787ZsmRM9e2VmPeBN4uqYvTtW7jvijg9N/y JsXecLq0q+WD6m8AAAD//wMAUEsDBBQABgAIAAAAIQA4/SH/1gAAAJQBAAALAAAAX3JlbHMvLnJl bHOkkMFqwzAMhu+DvYPRfXGawxijTi+j0GvpHsDYimMaW0Yy2fr2M4PBMnrbUb/Q94l/f/hMi1qR JVI2sOt6UJgd+ZiDgffL8ekFlFSbvV0oo4EbChzGx4f9GRdb25HMsYhqlCwG5lrLq9biZkxWOiqY 22YiTra2kYMu1l1tQD30/bPm3wwYN0x18gb45AdQl1tp5j/sFB2T0FQ7R0nTNEV3j6o9feQzro1i OWA14Fm+Q8a1a8+Bvu/d/dMb2JY5uiPbhG/ktn4cqGU/er3pcvwCAAD//wMAUEsDBBQABgAIAAAA IQBi1i+NqwEAAEADAAAOAAAAZHJzL2Uyb0RvYy54bWysUs1u2zAMvg/YOwi6L04yJFiNOD2k6y7d FqDdAzCSbAuTRYFUYuftJ6lJ9ncbpgNBiuRH8iM399PgxMkQW/SNXMzmUhivUFvfNfLby+O7D1Jw BK/BoTeNPBuW99u3bzZjqM0Se3TakEggnusxNLKPMdRVxao3A/AMg/HJ2SINEJNJXaUJxoQ+uGo5 n6+rEUkHQmWY0+/Dq1NuC37bGhW/ti2bKFwjU2+xSCrykGW13UDdEYTeqksb8A9dDGB9KnqDeoAI 4kj2L6jBKkLGNs4UDhW2rVWmzJCmWcz/mOa5h2DKLIkcDjea+P/Bqi+nnd9Tbl1N/jk8ofrOiZRq DFzfnNngsCdxGD+jTmuEY8Qy79TSkJPTJGIqtJ5vtJopCpU+369X67v1Sgp19VVQXxMDcfxkcBBZ aSRHAtv1cYfep+UhLUoZOD1xzG1BfU3IVT0+WufKDp0XYyPvVstVSWB0VmdnDmPqDjtH4gT5CsrL i09gv4URHr0uYL0B/fGiR7DuVU/xzl+oyWzkI+P6gPq8pwyXrbSmAnw5qXwHv9ol6ufhb38AAAD/ /wMAUEsDBBQABgAIAAAAIQAqDcAs4gAAAA4BAAAPAAAAZHJzL2Rvd25yZXYueG1sTI9PT4NAEMXv Jn6HzZh4MXYpDdhSlqbRePBo28Trlp0Cys4SdinYT+8YD/Uyyfx77/fyzWRbccbeN44UzGcRCKTS mYYqBYf96+MShA+ajG4doYJv9LApbm9ynRk30jued6ESLEI+0wrqELpMSl/WaLWfuQ6JdyfXWx24 7Stpej2yuG1lHEWptLohdqh1h881ll+7wSpAPyTzaLuy1eHtMj58xJfPsdsrdX83vay5bNcgAk7h +gG/GZgfCgY7uoGMF62CRZIyf1AQJykIPlgt4icQx7+BLHL5P0bxAwAA//8DAFBLAQItABQABgAI AAAAIQC2gziS/gAAAOEBAAATAAAAAAAAAAAAAAAAAAAAAABbQ29udGVudF9UeXBlc10ueG1sUEsB Ai0AFAAGAAgAAAAhADj9If/WAAAAlAEAAAsAAAAAAAAAAAAAAAAALwEAAF9yZWxzLy5yZWxzUEsB Ai0AFAAGAAgAAAAhAGLWL42rAQAAQAMAAA4AAAAAAAAAAAAAAAAALgIAAGRycy9lMm9Eb2MueG1s UEsBAi0AFAAGAAgAAAAhACoNwCziAAAADgEAAA8AAAAAAAAAAAAAAAAABQQAAGRycy9kb3ducmV2 LnhtbFBLBQYAAAAABAAEAPMAAAAUBQAAAAA= ">
+              <v:shape w14:anchorId="498FEB96" id="Straight Arrow Connector 16" o:spid="_x0000_s1026" type="#_x0000_t32" style="position:absolute;margin-left:187.1pt;margin-top:12.8pt;width:279.3pt;height:0;z-index:251656192;visibility:visible;mso-wrap-style:square;mso-width-percent:0;mso-height-percent:0;mso-wrap-distance-left:9pt;mso-wrap-distance-top:.mm;mso-wrap-distance-right:9pt;mso-wrap-distance-bottom:.mm;mso-position-horizontal:absolute;mso-position-horizontal-relative:text;mso-position-vertical:absolute;mso-position-vertical-relative:text;mso-width-percent:0;mso-height-percent:0;mso-width-relative:page;mso-height-relative:page" o:gfxdata="UEsDBBQABgAIAAAAIQC2gziS/gAAAOEBAAATAAAAW0NvbnRlbnRfVHlwZXNdLnhtbJSRQU7DMBBF 90jcwfIWJU67QAgl6YK0S0CoHGBkTxKLZGx5TGhvj5O2G0SRWNoz/78nu9wcxkFMGNg6quQqL6RA 0s5Y6ir5vt9lD1JwBDIwOMJKHpHlpr69KfdHjyxSmriSfYz+USnWPY7AufNIadK6MEJMx9ApD/oD OlTrorhX2lFEilmcO2RdNtjC5xDF9pCuTyYBB5bi6bQ4syoJ3g9WQ0ymaiLzg5KdCXlKLjvcW893 SUOqXwnz5DrgnHtJTxOsQfEKIT7DmDSUCaxw7Rqn8787ZsmRM9e2VmPeBN4uqYvTtW7jvijg9N/y JsXecLq0q+WD6m8AAAD//wMAUEsDBBQABgAIAAAAIQA4/SH/1gAAAJQBAAALAAAAX3JlbHMvLnJl bHOkkMFqwzAMhu+DvYPRfXGawxijTi+j0GvpHsDYimMaW0Yy2fr2M4PBMnrbUb/Q94l/f/hMi1qR JVI2sOt6UJgd+ZiDgffL8ekFlFSbvV0oo4EbChzGx4f9GRdb25HMsYhqlCwG5lrLq9biZkxWOiqY 22YiTra2kYMu1l1tQD30/bPm3wwYN0x18gb45AdQl1tp5j/sFB2T0FQ7R0nTNEV3j6o9feQzro1i OWA14Fm+Q8a1a8+Bvu/d/dMb2JY5uiPbhG/ktn4cqGU/er3pcvwCAAD//wMAUEsDBBQABgAIAAAA IQBi1i+NqwEAAEADAAAOAAAAZHJzL2Uyb0RvYy54bWysUs1u2zAMvg/YOwi6L04yJFiNOD2k6y7d FqDdAzCSbAuTRYFUYuftJ6lJ9ncbpgNBiuRH8iM399PgxMkQW/SNXMzmUhivUFvfNfLby+O7D1Jw BK/BoTeNPBuW99u3bzZjqM0Se3TakEggnusxNLKPMdRVxao3A/AMg/HJ2SINEJNJXaUJxoQ+uGo5 n6+rEUkHQmWY0+/Dq1NuC37bGhW/ti2bKFwjU2+xSCrykGW13UDdEYTeqksb8A9dDGB9KnqDeoAI 4kj2L6jBKkLGNs4UDhW2rVWmzJCmWcz/mOa5h2DKLIkcDjea+P/Bqi+nnd9Tbl1N/jk8ofrOiZRq DFzfnNngsCdxGD+jTmuEY8Qy79TSkJPTJGIqtJ5vtJopCpU+369X67v1Sgp19VVQXxMDcfxkcBBZ aSRHAtv1cYfep+UhLUoZOD1xzG1BfU3IVT0+WufKDp0XYyPvVstVSWB0VmdnDmPqDjtH4gT5CsrL i09gv4URHr0uYL0B/fGiR7DuVU/xzl+oyWzkI+P6gPq8pwyXrbSmAnw5qXwHv9ol6ufhb38AAAD/ /wMAUEsDBBQABgAIAAAAIQAqDcAs4gAAAA4BAAAPAAAAZHJzL2Rvd25yZXYueG1sTI9PT4NAEMXv Jn6HzZh4MXYpDdhSlqbRePBo28Trlp0Cys4SdinYT+8YD/Uyyfx77/fyzWRbccbeN44UzGcRCKTS mYYqBYf96+MShA+ajG4doYJv9LApbm9ynRk30jued6ESLEI+0wrqELpMSl/WaLWfuQ6JdyfXWx24 7Stpej2yuG1lHEWptLohdqh1h881ll+7wSpAPyTzaLuy1eHtMj58xJfPsdsrdX83vay5bNcgAk7h +gG/GZgfCgY7uoGMF62CRZIyf1AQJykIPlgt4icQx7+BLHL5P0bxAwAA//8DAFBLAQItABQABgAI AAAAIQC2gziS/gAAAOEBAAATAAAAAAAAAAAAAAAAAAAAAABbQ29udGVudF9UeXBlc10ueG1sUEsB Ai0AFAAGAAgAAAAhADj9If/WAAAAlAEAAAsAAAAAAAAAAAAAAAAALwEAAF9yZWxzLy5yZWxzUEsB Ai0AFAAGAAgAAAAhAGLWL42rAQAAQAMAAA4AAAAAAAAAAAAAAAAALgIAAGRycy9lMm9Eb2MueG1s UEsBAi0AFAAGAAgAAAAhACoNwCziAAAADgEAAA8AAAAAAAAAAAAAAAAABQQAAGRycy9kb3ducmV2 LnhtbFBLBQYAAAAABAAEAPMAAAAUBQAAAAA= ">
                 <o:lock v:ext="edit" shapetype="f"/>
               </v:shape>
             </w:pict>
@@ -393,12 +393,12 @@
               <wp:anchor distT="4294967294" distB="4294967294" distL="114300" distR="114300" simplePos="0" relativeHeight="251657216" behindDoc="0" locked="0" layoutInCell="1" allowOverlap="1" wp14:anchorId="3F3431EB" wp14:editId="506BD878">
                 <wp:simplePos x="0" y="0"/>
                 <wp:positionH relativeFrom="column">
-                  <wp:posOffset>2265680</wp:posOffset>
+                  <wp:posOffset>2375680</wp:posOffset>
                 </wp:positionH>
                 <wp:positionV relativeFrom="paragraph">
                   <wp:posOffset>189229</wp:posOffset>
                 </wp:positionV>
-                <wp:extent cx="3656965" cy="0"/>
+                <wp:extent cx="3546965" cy="0"/>
                 <wp:effectExtent l="0" t="0" r="635" b="0"/>
                 <wp:wrapNone/>
                 <wp:docPr id="15" name="Straight Arrow Connector 15"/>
@@ -414,7 +414,7 @@
                       <wps:spPr bwMode="auto">
                         <a:xfrm>
                           <a:off x="0" y="0"/>
-                          <a:ext cx="3656965" cy="0"/>
+                          <a:ext cx="3546965" cy="0"/>
                         </a:xfrm>
                         <a:prstGeom prst="straightConnector1">
                           <a:avLst/>
@@ -444,7 +444,7 @@
           </mc:Choice>
           <mc:Fallback xmlns:oel="http://schemas.microsoft.com/office/2019/extlst">
             <w:pict>
-              <v:shape w14:anchorId="1998D8ED" id="Straight Arrow Connector 15" o:spid="_x0000_s1026" type="#_x0000_t32" style="position:absolute;margin-left:178.4pt;margin-top:14.9pt;width:287.95pt;height:0;z-index:251657216;visibility:visible;mso-wrap-style:square;mso-width-percent:0;mso-height-percent:0;mso-wrap-distance-left:9pt;mso-wrap-distance-top:.mm;mso-wrap-distance-right:9pt;mso-wrap-distance-bottom:.mm;mso-position-horizontal:absolute;mso-position-horizontal-relative:text;mso-position-vertical:absolute;mso-position-vertical-relative:text;mso-width-percent:0;mso-height-percent:0;mso-width-relative:page;mso-height-relative:page" o:gfxdata="UEsDBBQABgAIAAAAIQC2gziS/gAAAOEBAAATAAAAW0NvbnRlbnRfVHlwZXNdLnhtbJSRQU7DMBBF 90jcwfIWJU67QAgl6YK0S0CoHGBkTxKLZGx5TGhvj5O2G0SRWNoz/78nu9wcxkFMGNg6quQqL6RA 0s5Y6ir5vt9lD1JwBDIwOMJKHpHlpr69KfdHjyxSmriSfYz+USnWPY7AufNIadK6MEJMx9ApD/oD OlTrorhX2lFEilmcO2RdNtjC5xDF9pCuTyYBB5bi6bQ4syoJ3g9WQ0ymaiLzg5KdCXlKLjvcW893 SUOqXwnz5DrgnHtJTxOsQfEKIT7DmDSUCaxw7Rqn8787ZsmRM9e2VmPeBN4uqYvTtW7jvijg9N/y JsXecLq0q+WD6m8AAAD//wMAUEsDBBQABgAIAAAAIQA4/SH/1gAAAJQBAAALAAAAX3JlbHMvLnJl bHOkkMFqwzAMhu+DvYPRfXGawxijTi+j0GvpHsDYimMaW0Yy2fr2M4PBMnrbUb/Q94l/f/hMi1qR JVI2sOt6UJgd+ZiDgffL8ekFlFSbvV0oo4EbChzGx4f9GRdb25HMsYhqlCwG5lrLq9biZkxWOiqY 22YiTra2kYMu1l1tQD30/bPm3wwYN0x18gb45AdQl1tp5j/sFB2T0FQ7R0nTNEV3j6o9feQzro1i OWA14Fm+Q8a1a8+Bvu/d/dMb2JY5uiPbhG/ktn4cqGU/er3pcvwCAAD//wMAUEsDBBQABgAIAAAA IQBi1i+NqwEAAEADAAAOAAAAZHJzL2Uyb0RvYy54bWysUs1u2zAMvg/YOwi6L04yJFiNOD2k6y7d FqDdAzCSbAuTRYFUYuftJ6lJ9ncbpgNBiuRH8iM399PgxMkQW/SNXMzmUhivUFvfNfLby+O7D1Jw BK/BoTeNPBuW99u3bzZjqM0Se3TakEggnusxNLKPMdRVxao3A/AMg/HJ2SINEJNJXaUJxoQ+uGo5 n6+rEUkHQmWY0+/Dq1NuC37bGhW/ti2bKFwjU2+xSCrykGW13UDdEYTeqksb8A9dDGB9KnqDeoAI 4kj2L6jBKkLGNs4UDhW2rVWmzJCmWcz/mOa5h2DKLIkcDjea+P/Bqi+nnd9Tbl1N/jk8ofrOiZRq DFzfnNngsCdxGD+jTmuEY8Qy79TSkJPTJGIqtJ5vtJopCpU+369X67v1Sgp19VVQXxMDcfxkcBBZ aSRHAtv1cYfep+UhLUoZOD1xzG1BfU3IVT0+WufKDp0XYyPvVstVSWB0VmdnDmPqDjtH4gT5CsrL i09gv4URHr0uYL0B/fGiR7DuVU/xzl+oyWzkI+P6gPq8pwyXrbSmAnw5qXwHv9ol6ufhb38AAAD/ /wMAUEsDBBQABgAIAAAAIQBEmx5g4gAAAA4BAAAPAAAAZHJzL2Rvd25yZXYueG1sTI9NT8JAEIbv JvyHzZBwMbKlBLSlW0IwHjwKJF6X7thWu7NNd0srv94xHvAyk/l653mz7WgbccHO144ULOYRCKTC mZpKBafjy8MTCB80Gd04QgXf6GGbT+4ynRo30BteDqEULEI+1QqqENpUSl9UaLWfuxaJZx+uszpw 2ZXSdHpgcdvIOIrW0uqa+EOlW9xXWHwdeqsAfb9aRLvElqfX63D/Hl8/h/ao1Gw6Pm847DYgAo7h dgG/HpgfcgY7u56MF42C5WrN/EFBnHDmhWQZP4I4/zVknsn/NvIfAAAA//8DAFBLAQItABQABgAI AAAAIQC2gziS/gAAAOEBAAATAAAAAAAAAAAAAAAAAAAAAABbQ29udGVudF9UeXBlc10ueG1sUEsB Ai0AFAAGAAgAAAAhADj9If/WAAAAlAEAAAsAAAAAAAAAAAAAAAAALwEAAF9yZWxzLy5yZWxzUEsB Ai0AFAAGAAgAAAAhAGLWL42rAQAAQAMAAA4AAAAAAAAAAAAAAAAALgIAAGRycy9lMm9Eb2MueG1s UEsBAi0AFAAGAAgAAAAhAESbHmDiAAAADgEAAA8AAAAAAAAAAAAAAAAABQQAAGRycy9kb3ducmV2 LnhtbFBLBQYAAAAABAAEAPMAAAAUBQAAAAA= ">
+              <v:shape w14:anchorId="1998D8ED" id="Straight Arrow Connector 15" o:spid="_x0000_s1026" type="#_x0000_t32" style="position:absolute;margin-left:187.1pt;margin-top:14.9pt;width:279.3pt;height:0;z-index:251657216;visibility:visible;mso-wrap-style:square;mso-width-percent:0;mso-height-percent:0;mso-wrap-distance-left:9pt;mso-wrap-distance-top:.mm;mso-wrap-distance-right:9pt;mso-wrap-distance-bottom:.mm;mso-position-horizontal:absolute;mso-position-horizontal-relative:text;mso-position-vertical:absolute;mso-position-vertical-relative:text;mso-width-percent:0;mso-height-percent:0;mso-width-relative:page;mso-height-relative:page" o:gfxdata="UEsDBBQABgAIAAAAIQC2gziS/gAAAOEBAAATAAAAW0NvbnRlbnRfVHlwZXNdLnhtbJSRQU7DMBBF 90jcwfIWJU67QAgl6YK0S0CoHGBkTxKLZGx5TGhvj5O2G0SRWNoz/78nu9wcxkFMGNg6quQqL6RA 0s5Y6ir5vt9lD1JwBDIwOMJKHpHlpr69KfdHjyxSmriSfYz+USnWPY7AufNIadK6MEJMx9ApD/oD OlTrorhX2lFEilmcO2RdNtjC5xDF9pCuTyYBB5bi6bQ4syoJ3g9WQ0ymaiLzg5KdCXlKLjvcW893 SUOqXwnz5DrgnHtJTxOsQfEKIT7DmDSUCaxw7Rqn8787ZsmRM9e2VmPeBN4uqYvTtW7jvijg9N/y JsXecLq0q+WD6m8AAAD//wMAUEsDBBQABgAIAAAAIQA4/SH/1gAAAJQBAAALAAAAX3JlbHMvLnJl bHOkkMFqwzAMhu+DvYPRfXGawxijTi+j0GvpHsDYimMaW0Yy2fr2M4PBMnrbUb/Q94l/f/hMi1qR JVI2sOt6UJgd+ZiDgffL8ekFlFSbvV0oo4EbChzGx4f9GRdb25HMsYhqlCwG5lrLq9biZkxWOiqY 22YiTra2kYMu1l1tQD30/bPm3wwYN0x18gb45AdQl1tp5j/sFB2T0FQ7R0nTNEV3j6o9feQzro1i OWA14Fm+Q8a1a8+Bvu/d/dMb2JY5uiPbhG/ktn4cqGU/er3pcvwCAAD//wMAUEsDBBQABgAIAAAA IQBi1i+NqwEAAEADAAAOAAAAZHJzL2Uyb0RvYy54bWysUs1u2zAMvg/YOwi6L04yJFiNOD2k6y7d FqDdAzCSbAuTRYFUYuftJ6lJ9ncbpgNBiuRH8iM399PgxMkQW/SNXMzmUhivUFvfNfLby+O7D1Jw BK/BoTeNPBuW99u3bzZjqM0Se3TakEggnusxNLKPMdRVxao3A/AMg/HJ2SINEJNJXaUJxoQ+uGo5 n6+rEUkHQmWY0+/Dq1NuC37bGhW/ti2bKFwjU2+xSCrykGW13UDdEYTeqksb8A9dDGB9KnqDeoAI 4kj2L6jBKkLGNs4UDhW2rVWmzJCmWcz/mOa5h2DKLIkcDjea+P/Bqi+nnd9Tbl1N/jk8ofrOiZRq DFzfnNngsCdxGD+jTmuEY8Qy79TSkJPTJGIqtJ5vtJopCpU+369X67v1Sgp19VVQXxMDcfxkcBBZ aSRHAtv1cYfep+UhLUoZOD1xzG1BfU3IVT0+WufKDp0XYyPvVstVSWB0VmdnDmPqDjtH4gT5CsrL i09gv4URHr0uYL0B/fGiR7DuVU/xzl+oyWzkI+P6gPq8pwyXrbSmAnw5qXwHv9ol6ufhb38AAAD/ /wMAUEsDBBQABgAIAAAAIQBEmx5g4gAAAA4BAAAPAAAAZHJzL2Rvd25yZXYueG1sTI9NT8JAEIbv JvyHzZBwMbKlBLSlW0IwHjwKJF6X7thWu7NNd0srv94xHvAyk/l653mz7WgbccHO144ULOYRCKTC mZpKBafjy8MTCB80Gd04QgXf6GGbT+4ynRo30BteDqEULEI+1QqqENpUSl9UaLWfuxaJZx+uszpw 2ZXSdHpgcdvIOIrW0uqa+EOlW9xXWHwdeqsAfb9aRLvElqfX63D/Hl8/h/ao1Gw6Pm847DYgAo7h dgG/HpgfcgY7u56MF42C5WrN/EFBnHDmhWQZP4I4/zVknsn/NvIfAAAA//8DAFBLAQItABQABgAI AAAAIQC2gziS/gAAAOEBAAATAAAAAAAAAAAAAAAAAAAAAABbQ29udGVudF9UeXBlc10ueG1sUEsB Ai0AFAAGAAgAAAAhADj9If/WAAAAlAEAAAsAAAAAAAAAAAAAAAAALwEAAF9yZWxzLy5yZWxzUEsB Ai0AFAAGAAgAAAAhAGLWL42rAQAAQAMAAA4AAAAAAAAAAAAAAAAALgIAAGRycy9lMm9Eb2MueG1s UEsBAi0AFAAGAAgAAAAhAESbHmDiAAAADgEAAA8AAAAAAAAAAAAAAAAABQQAAGRycy9kb3ducmV2 LnhtbFBLBQYAAAAABAAEAPMAAAAUBQAAAAA= ">
                 <o:lock v:ext="edit" shapetype="f"/>
               </v:shape>
             </w:pict>
@@ -591,12 +591,12 @@
               <wp:anchor distT="4294967294" distB="4294967294" distL="114300" distR="114300" simplePos="0" relativeHeight="251658240" behindDoc="0" locked="0" layoutInCell="1" allowOverlap="1" wp14:anchorId="545C4D35" wp14:editId="740ACD62">
                 <wp:simplePos x="0" y="0"/>
                 <wp:positionH relativeFrom="column">
-                  <wp:posOffset>2265680</wp:posOffset>
+                  <wp:posOffset>2375680</wp:posOffset>
                 </wp:positionH>
                 <wp:positionV relativeFrom="paragraph">
                   <wp:posOffset>187324</wp:posOffset>
                 </wp:positionV>
-                <wp:extent cx="3656965" cy="0"/>
+                <wp:extent cx="3546965" cy="0"/>
                 <wp:effectExtent l="0" t="0" r="635" b="0"/>
                 <wp:wrapNone/>
                 <wp:docPr id="14" name="Straight Arrow Connector 14"/>
@@ -612,7 +612,7 @@
                       <wps:spPr bwMode="auto">
                         <a:xfrm>
                           <a:off x="0" y="0"/>
-                          <a:ext cx="3656965" cy="0"/>
+                          <a:ext cx="3546965" cy="0"/>
                         </a:xfrm>
                         <a:prstGeom prst="straightConnector1">
                           <a:avLst/>
@@ -642,7 +642,7 @@
           </mc:Choice>
           <mc:Fallback xmlns:oel="http://schemas.microsoft.com/office/2019/extlst">
             <w:pict>
-              <v:shape w14:anchorId="2F36D47E" id="Straight Arrow Connector 14" o:spid="_x0000_s1026" type="#_x0000_t32" style="position:absolute;margin-left:178.4pt;margin-top:14.75pt;width:287.95pt;height:0;z-index:251658240;visibility:visible;mso-wrap-style:square;mso-width-percent:0;mso-height-percent:0;mso-wrap-distance-left:9pt;mso-wrap-distance-top:.mm;mso-wrap-distance-right:9pt;mso-wrap-distance-bottom:.mm;mso-position-horizontal:absolute;mso-position-horizontal-relative:text;mso-position-vertical:absolute;mso-position-vertical-relative:text;mso-width-percent:0;mso-height-percent:0;mso-width-relative:page;mso-height-relative:page" o:gfxdata="UEsDBBQABgAIAAAAIQC2gziS/gAAAOEBAAATAAAAW0NvbnRlbnRfVHlwZXNdLnhtbJSRQU7DMBBF 90jcwfIWJU67QAgl6YK0S0CoHGBkTxKLZGx5TGhvj5O2G0SRWNoz/78nu9wcxkFMGNg6quQqL6RA 0s5Y6ir5vt9lD1JwBDIwOMJKHpHlpr69KfdHjyxSmriSfYz+USnWPY7AufNIadK6MEJMx9ApD/oD OlTrorhX2lFEilmcO2RdNtjC5xDF9pCuTyYBB5bi6bQ4syoJ3g9WQ0ymaiLzg5KdCXlKLjvcW893 SUOqXwnz5DrgnHtJTxOsQfEKIT7DmDSUCaxw7Rqn8787ZsmRM9e2VmPeBN4uqYvTtW7jvijg9N/y JsXecLq0q+WD6m8AAAD//wMAUEsDBBQABgAIAAAAIQA4/SH/1gAAAJQBAAALAAAAX3JlbHMvLnJl bHOkkMFqwzAMhu+DvYPRfXGawxijTi+j0GvpHsDYimMaW0Yy2fr2M4PBMnrbUb/Q94l/f/hMi1qR JVI2sOt6UJgd+ZiDgffL8ekFlFSbvV0oo4EbChzGx4f9GRdb25HMsYhqlCwG5lrLq9biZkxWOiqY 22YiTra2kYMu1l1tQD30/bPm3wwYN0x18gb45AdQl1tp5j/sFB2T0FQ7R0nTNEV3j6o9feQzro1i OWA14Fm+Q8a1a8+Bvu/d/dMb2JY5uiPbhG/ktn4cqGU/er3pcvwCAAD//wMAUEsDBBQABgAIAAAA IQBi1i+NqwEAAEADAAAOAAAAZHJzL2Uyb0RvYy54bWysUs1u2zAMvg/YOwi6L04yJFiNOD2k6y7d FqDdAzCSbAuTRYFUYuftJ6lJ9ncbpgNBiuRH8iM399PgxMkQW/SNXMzmUhivUFvfNfLby+O7D1Jw BK/BoTeNPBuW99u3bzZjqM0Se3TakEggnusxNLKPMdRVxao3A/AMg/HJ2SINEJNJXaUJxoQ+uGo5 n6+rEUkHQmWY0+/Dq1NuC37bGhW/ti2bKFwjU2+xSCrykGW13UDdEYTeqksb8A9dDGB9KnqDeoAI 4kj2L6jBKkLGNs4UDhW2rVWmzJCmWcz/mOa5h2DKLIkcDjea+P/Bqi+nnd9Tbl1N/jk8ofrOiZRq DFzfnNngsCdxGD+jTmuEY8Qy79TSkJPTJGIqtJ5vtJopCpU+369X67v1Sgp19VVQXxMDcfxkcBBZ aSRHAtv1cYfep+UhLUoZOD1xzG1BfU3IVT0+WufKDp0XYyPvVstVSWB0VmdnDmPqDjtH4gT5CsrL i09gv4URHr0uYL0B/fGiR7DuVU/xzl+oyWzkI+P6gPq8pwyXrbSmAnw5qXwHv9ol6ufhb38AAAD/ /wMAUEsDBBQABgAIAAAAIQBXNrWK4gAAAA4BAAAPAAAAZHJzL2Rvd25yZXYueG1sTI9PT4NAEMXv Jn6HzZh4MXYpDbVQlqbRePBo28Trlp0Cys4SdinYT+8YD/Uyyfx77/fyzWRbccbeN44UzGcRCKTS mYYqBYf96+MKhA+ajG4doYJv9LApbm9ynRk30jued6ESLEI+0wrqELpMSl/WaLWfuQ6JdyfXWx24 7Stpej2yuG1lHEVLaXVD7FDrDp9rLL92g1WAfkjm0Ta11eHtMj58xJfPsdsrdX83vay5bNcgAk7h +gG/GZgfCgY7uoGMF62CRbJk/qAgThMQfJAu4icQx7+BLHL5P0bxAwAA//8DAFBLAQItABQABgAI AAAAIQC2gziS/gAAAOEBAAATAAAAAAAAAAAAAAAAAAAAAABbQ29udGVudF9UeXBlc10ueG1sUEsB Ai0AFAAGAAgAAAAhADj9If/WAAAAlAEAAAsAAAAAAAAAAAAAAAAALwEAAF9yZWxzLy5yZWxzUEsB Ai0AFAAGAAgAAAAhAGLWL42rAQAAQAMAAA4AAAAAAAAAAAAAAAAALgIAAGRycy9lMm9Eb2MueG1s UEsBAi0AFAAGAAgAAAAhAFc2tYriAAAADgEAAA8AAAAAAAAAAAAAAAAABQQAAGRycy9kb3ducmV2 LnhtbFBLBQYAAAAABAAEAPMAAAAUBQAAAAA= ">
+              <v:shape w14:anchorId="2F36D47E" id="Straight Arrow Connector 14" o:spid="_x0000_s1026" type="#_x0000_t32" style="position:absolute;margin-left:187.1pt;margin-top:14.75pt;width:279.3pt;height:0;z-index:251658240;visibility:visible;mso-wrap-style:square;mso-width-percent:0;mso-height-percent:0;mso-wrap-distance-left:9pt;mso-wrap-distance-top:.mm;mso-wrap-distance-right:9pt;mso-wrap-distance-bottom:.mm;mso-position-horizontal:absolute;mso-position-horizontal-relative:text;mso-position-vertical:absolute;mso-position-vertical-relative:text;mso-width-percent:0;mso-height-percent:0;mso-width-relative:page;mso-height-relative:page" o:gfxdata="UEsDBBQABgAIAAAAIQC2gziS/gAAAOEBAAATAAAAW0NvbnRlbnRfVHlwZXNdLnhtbJSRQU7DMBBF 90jcwfIWJU67QAgl6YK0S0CoHGBkTxKLZGx5TGhvj5O2G0SRWNoz/78nu9wcxkFMGNg6quQqL6RA 0s5Y6ir5vt9lD1JwBDIwOMJKHpHlpr69KfdHjyxSmriSfYz+USnWPY7AufNIadK6MEJMx9ApD/oD OlTrorhX2lFEilmcO2RdNtjC5xDF9pCuTyYBB5bi6bQ4syoJ3g9WQ0ymaiLzg5KdCXlKLjvcW893 SUOqXwnz5DrgnHtJTxOsQfEKIT7DmDSUCaxw7Rqn8787ZsmRM9e2VmPeBN4uqYvTtW7jvijg9N/y JsXecLq0q+WD6m8AAAD//wMAUEsDBBQABgAIAAAAIQA4/SH/1gAAAJQBAAALAAAAX3JlbHMvLnJl bHOkkMFqwzAMhu+DvYPRfXGawxijTi+j0GvpHsDYimMaW0Yy2fr2M4PBMnrbUb/Q94l/f/hMi1qR JVI2sOt6UJgd+ZiDgffL8ekFlFSbvV0oo4EbChzGx4f9GRdb25HMsYhqlCwG5lrLq9biZkxWOiqY 22YiTra2kYMu1l1tQD30/bPm3wwYN0x18gb45AdQl1tp5j/sFB2T0FQ7R0nTNEV3j6o9feQzro1i OWA14Fm+Q8a1a8+Bvu/d/dMb2JY5uiPbhG/ktn4cqGU/er3pcvwCAAD//wMAUEsDBBQABgAIAAAA IQBi1i+NqwEAAEADAAAOAAAAZHJzL2Uyb0RvYy54bWysUs1u2zAMvg/YOwi6L04yJFiNOD2k6y7d FqDdAzCSbAuTRYFUYuftJ6lJ9ncbpgNBiuRH8iM399PgxMkQW/SNXMzmUhivUFvfNfLby+O7D1Jw BK/BoTeNPBuW99u3bzZjqM0Se3TakEggnusxNLKPMdRVxao3A/AMg/HJ2SINEJNJXaUJxoQ+uGo5 n6+rEUkHQmWY0+/Dq1NuC37bGhW/ti2bKFwjU2+xSCrykGW13UDdEYTeqksb8A9dDGB9KnqDeoAI 4kj2L6jBKkLGNs4UDhW2rVWmzJCmWcz/mOa5h2DKLIkcDjea+P/Bqi+nnd9Tbl1N/jk8ofrOiZRq DFzfnNngsCdxGD+jTmuEY8Qy79TSkJPTJGIqtJ5vtJopCpU+369X67v1Sgp19VVQXxMDcfxkcBBZ aSRHAtv1cYfep+UhLUoZOD1xzG1BfU3IVT0+WufKDp0XYyPvVstVSWB0VmdnDmPqDjtH4gT5CsrL i09gv4URHr0uYL0B/fGiR7DuVU/xzl+oyWzkI+P6gPq8pwyXrbSmAnw5qXwHv9ol6ufhb38AAAD/ /wMAUEsDBBQABgAIAAAAIQBXNrWK4gAAAA4BAAAPAAAAZHJzL2Rvd25yZXYueG1sTI9PT4NAEMXv Jn6HzZh4MXYpDbVQlqbRePBo28Trlp0Cys4SdinYT+8YD/Uyyfx77/fyzWRbccbeN44UzGcRCKTS mYYqBYf96+MKhA+ajG4doYJv9LApbm9ynRk30jued6ESLEI+0wrqELpMSl/WaLWfuQ6JdyfXWx24 7Stpej2yuG1lHEVLaXVD7FDrDp9rLL92g1WAfkjm0Ta11eHtMj58xJfPsdsrdX83vay5bNcgAk7h +gG/GZgfCgY7uoGMF62CRbJk/qAgThMQfJAu4icQx7+BLHL5P0bxAwAA//8DAFBLAQItABQABgAI AAAAIQC2gziS/gAAAOEBAAATAAAAAAAAAAAAAAAAAAAAAABbQ29udGVudF9UeXBlc10ueG1sUEsB Ai0AFAAGAAgAAAAhADj9If/WAAAAlAEAAAsAAAAAAAAAAAAAAAAALwEAAF9yZWxzLy5yZWxzUEsB Ai0AFAAGAAgAAAAhAGLWL42rAQAAQAMAAA4AAAAAAAAAAAAAAAAALgIAAGRycy9lMm9Eb2MueG1s UEsBAi0AFAAGAAgAAAAhAFc2tYriAAAADgEAAA8AAAAAAAAAAAAAAAAABQQAAGRycy9kb3ducmV2 LnhtbFBLBQYAAAAABAAEAPMAAAAUBQAAAAA= ">
                 <o:lock v:ext="edit" shapetype="f"/>
               </v:shape>
             </w:pict>
@@ -2373,13 +2373,17 @@
         <w:t>………………………………………………………………………………………….</w:t>
       </w:r>
     </w:p>
-    <w:p/>
     <w:p>
-      <w:r>
-        <w:br w:type="page"/>
-      </w:r>
+      <w:pPr>
+        <w:sectPr>
+          <w:headerReference w:type="default" r:id="rId6"/>
+          <w:pgSz w:w="11907" w:h="16839" w:code="9"/>
+          <w:pgMar w:top="992" w:right="1134" w:bottom="142" w:left="1418" w:header="567" w:footer="720" w:gutter="0"/>
+          <w:cols w:space="720"/>
+          <w:docGrid w:linePitch="360"/>
+        </w:sectPr>
+      </w:pPr>
     </w:p>
-    <w:p/>
     <w:tbl>
       <w:tblPr>
         <w:tblStyle w:val="TableGrid"/>
@@ -2703,7 +2707,6 @@
       </w:r>
     </w:p>
     <w:sectPr>
-      <w:headerReference w:type="default" r:id="rId6"/>
       <w:pgSz w:w="11907" w:h="16839" w:code="9"/>
       <w:pgMar w:top="992" w:right="1134" w:bottom="142" w:left="1418" w:header="567" w:footer="720" w:gutter="0"/>
       <w:cols w:space="720"/>

</xml_diff>

<commit_message>
Add Updated Leave Form
</commit_message>
<xml_diff>
--- a/assets/leave-form-template.docx
+++ b/assets/leave-form-template.docx
@@ -176,12 +176,12 @@
               <wp:anchor distT="4294967294" distB="4294967294" distL="114300" distR="114300" simplePos="0" relativeHeight="251656192" behindDoc="0" locked="0" layoutInCell="1" allowOverlap="1" wp14:anchorId="0B0CE4CE" wp14:editId="08B2675E">
                 <wp:simplePos x="0" y="0"/>
                 <wp:positionH relativeFrom="column">
-                  <wp:posOffset>2375680</wp:posOffset>
+                  <wp:posOffset>2265680</wp:posOffset>
                 </wp:positionH>
                 <wp:positionV relativeFrom="paragraph">
                   <wp:posOffset>162559</wp:posOffset>
                 </wp:positionV>
-                <wp:extent cx="3546965" cy="0"/>
+                <wp:extent cx="3656965" cy="0"/>
                 <wp:effectExtent l="0" t="0" r="635" b="0"/>
                 <wp:wrapNone/>
                 <wp:docPr id="16" name="Straight Arrow Connector 16"/>
@@ -197,7 +197,7 @@
                       <wps:spPr bwMode="auto">
                         <a:xfrm>
                           <a:off x="0" y="0"/>
-                          <a:ext cx="3546965" cy="0"/>
+                          <a:ext cx="3656965" cy="0"/>
                         </a:xfrm>
                         <a:prstGeom prst="straightConnector1">
                           <a:avLst/>
@@ -227,7 +227,7 @@
           </mc:Choice>
           <mc:Fallback xmlns:oel="http://schemas.microsoft.com/office/2019/extlst">
             <w:pict>
-              <v:shape w14:anchorId="498FEB96" id="Straight Arrow Connector 16" o:spid="_x0000_s1026" type="#_x0000_t32" style="position:absolute;margin-left:187.1pt;margin-top:12.8pt;width:279.3pt;height:0;z-index:251656192;visibility:visible;mso-wrap-style:square;mso-width-percent:0;mso-height-percent:0;mso-wrap-distance-left:9pt;mso-wrap-distance-top:.mm;mso-wrap-distance-right:9pt;mso-wrap-distance-bottom:.mm;mso-position-horizontal:absolute;mso-position-horizontal-relative:text;mso-position-vertical:absolute;mso-position-vertical-relative:text;mso-width-percent:0;mso-height-percent:0;mso-width-relative:page;mso-height-relative:page" o:gfxdata="UEsDBBQABgAIAAAAIQC2gziS/gAAAOEBAAATAAAAW0NvbnRlbnRfVHlwZXNdLnhtbJSRQU7DMBBF 90jcwfIWJU67QAgl6YK0S0CoHGBkTxKLZGx5TGhvj5O2G0SRWNoz/78nu9wcxkFMGNg6quQqL6RA 0s5Y6ir5vt9lD1JwBDIwOMJKHpHlpr69KfdHjyxSmriSfYz+USnWPY7AufNIadK6MEJMx9ApD/oD OlTrorhX2lFEilmcO2RdNtjC5xDF9pCuTyYBB5bi6bQ4syoJ3g9WQ0ymaiLzg5KdCXlKLjvcW893 SUOqXwnz5DrgnHtJTxOsQfEKIT7DmDSUCaxw7Rqn8787ZsmRM9e2VmPeBN4uqYvTtW7jvijg9N/y JsXecLq0q+WD6m8AAAD//wMAUEsDBBQABgAIAAAAIQA4/SH/1gAAAJQBAAALAAAAX3JlbHMvLnJl bHOkkMFqwzAMhu+DvYPRfXGawxijTi+j0GvpHsDYimMaW0Yy2fr2M4PBMnrbUb/Q94l/f/hMi1qR JVI2sOt6UJgd+ZiDgffL8ekFlFSbvV0oo4EbChzGx4f9GRdb25HMsYhqlCwG5lrLq9biZkxWOiqY 22YiTra2kYMu1l1tQD30/bPm3wwYN0x18gb45AdQl1tp5j/sFB2T0FQ7R0nTNEV3j6o9feQzro1i OWA14Fm+Q8a1a8+Bvu/d/dMb2JY5uiPbhG/ktn4cqGU/er3pcvwCAAD//wMAUEsDBBQABgAIAAAA IQBi1i+NqwEAAEADAAAOAAAAZHJzL2Uyb0RvYy54bWysUs1u2zAMvg/YOwi6L04yJFiNOD2k6y7d FqDdAzCSbAuTRYFUYuftJ6lJ9ncbpgNBiuRH8iM399PgxMkQW/SNXMzmUhivUFvfNfLby+O7D1Jw BK/BoTeNPBuW99u3bzZjqM0Se3TakEggnusxNLKPMdRVxao3A/AMg/HJ2SINEJNJXaUJxoQ+uGo5 n6+rEUkHQmWY0+/Dq1NuC37bGhW/ti2bKFwjU2+xSCrykGW13UDdEYTeqksb8A9dDGB9KnqDeoAI 4kj2L6jBKkLGNs4UDhW2rVWmzJCmWcz/mOa5h2DKLIkcDjea+P/Bqi+nnd9Tbl1N/jk8ofrOiZRq DFzfnNngsCdxGD+jTmuEY8Qy79TSkJPTJGIqtJ5vtJopCpU+369X67v1Sgp19VVQXxMDcfxkcBBZ aSRHAtv1cYfep+UhLUoZOD1xzG1BfU3IVT0+WufKDp0XYyPvVstVSWB0VmdnDmPqDjtH4gT5CsrL i09gv4URHr0uYL0B/fGiR7DuVU/xzl+oyWzkI+P6gPq8pwyXrbSmAnw5qXwHv9ol6ufhb38AAAD/ /wMAUEsDBBQABgAIAAAAIQAqDcAs4gAAAA4BAAAPAAAAZHJzL2Rvd25yZXYueG1sTI9PT4NAEMXv Jn6HzZh4MXYpDdhSlqbRePBo28Trlp0Cys4SdinYT+8YD/Uyyfx77/fyzWRbccbeN44UzGcRCKTS mYYqBYf96+MShA+ajG4doYJv9LApbm9ynRk30jued6ESLEI+0wrqELpMSl/WaLWfuQ6JdyfXWx24 7Stpej2yuG1lHEWptLohdqh1h881ll+7wSpAPyTzaLuy1eHtMj58xJfPsdsrdX83vay5bNcgAk7h +gG/GZgfCgY7uoGMF62CRZIyf1AQJykIPlgt4icQx7+BLHL5P0bxAwAA//8DAFBLAQItABQABgAI AAAAIQC2gziS/gAAAOEBAAATAAAAAAAAAAAAAAAAAAAAAABbQ29udGVudF9UeXBlc10ueG1sUEsB Ai0AFAAGAAgAAAAhADj9If/WAAAAlAEAAAsAAAAAAAAAAAAAAAAALwEAAF9yZWxzLy5yZWxzUEsB Ai0AFAAGAAgAAAAhAGLWL42rAQAAQAMAAA4AAAAAAAAAAAAAAAAALgIAAGRycy9lMm9Eb2MueG1s UEsBAi0AFAAGAAgAAAAhACoNwCziAAAADgEAAA8AAAAAAAAAAAAAAAAABQQAAGRycy9kb3ducmV2 LnhtbFBLBQYAAAAABAAEAPMAAAAUBQAAAAA= ">
+              <v:shape w14:anchorId="498FEB96" id="Straight Arrow Connector 16" o:spid="_x0000_s1026" type="#_x0000_t32" style="position:absolute;margin-left:178.4pt;margin-top:12.8pt;width:287.95pt;height:0;z-index:251656192;visibility:visible;mso-wrap-style:square;mso-width-percent:0;mso-height-percent:0;mso-wrap-distance-left:9pt;mso-wrap-distance-top:.mm;mso-wrap-distance-right:9pt;mso-wrap-distance-bottom:.mm;mso-position-horizontal:absolute;mso-position-horizontal-relative:text;mso-position-vertical:absolute;mso-position-vertical-relative:text;mso-width-percent:0;mso-height-percent:0;mso-width-relative:page;mso-height-relative:page" o:gfxdata="UEsDBBQABgAIAAAAIQC2gziS/gAAAOEBAAATAAAAW0NvbnRlbnRfVHlwZXNdLnhtbJSRQU7DMBBF 90jcwfIWJU67QAgl6YK0S0CoHGBkTxKLZGx5TGhvj5O2G0SRWNoz/78nu9wcxkFMGNg6quQqL6RA 0s5Y6ir5vt9lD1JwBDIwOMJKHpHlpr69KfdHjyxSmriSfYz+USnWPY7AufNIadK6MEJMx9ApD/oD OlTrorhX2lFEilmcO2RdNtjC5xDF9pCuTyYBB5bi6bQ4syoJ3g9WQ0ymaiLzg5KdCXlKLjvcW893 SUOqXwnz5DrgnHtJTxOsQfEKIT7DmDSUCaxw7Rqn8787ZsmRM9e2VmPeBN4uqYvTtW7jvijg9N/y JsXecLq0q+WD6m8AAAD//wMAUEsDBBQABgAIAAAAIQA4/SH/1gAAAJQBAAALAAAAX3JlbHMvLnJl bHOkkMFqwzAMhu+DvYPRfXGawxijTi+j0GvpHsDYimMaW0Yy2fr2M4PBMnrbUb/Q94l/f/hMi1qR JVI2sOt6UJgd+ZiDgffL8ekFlFSbvV0oo4EbChzGx4f9GRdb25HMsYhqlCwG5lrLq9biZkxWOiqY 22YiTra2kYMu1l1tQD30/bPm3wwYN0x18gb45AdQl1tp5j/sFB2T0FQ7R0nTNEV3j6o9feQzro1i OWA14Fm+Q8a1a8+Bvu/d/dMb2JY5uiPbhG/ktn4cqGU/er3pcvwCAAD//wMAUEsDBBQABgAIAAAA IQBi1i+NqwEAAEADAAAOAAAAZHJzL2Uyb0RvYy54bWysUs1u2zAMvg/YOwi6L04yJFiNOD2k6y7d FqDdAzCSbAuTRYFUYuftJ6lJ9ncbpgNBiuRH8iM399PgxMkQW/SNXMzmUhivUFvfNfLby+O7D1Jw BK/BoTeNPBuW99u3bzZjqM0Se3TakEggnusxNLKPMdRVxao3A/AMg/HJ2SINEJNJXaUJxoQ+uGo5 n6+rEUkHQmWY0+/Dq1NuC37bGhW/ti2bKFwjU2+xSCrykGW13UDdEYTeqksb8A9dDGB9KnqDeoAI 4kj2L6jBKkLGNs4UDhW2rVWmzJCmWcz/mOa5h2DKLIkcDjea+P/Bqi+nnd9Tbl1N/jk8ofrOiZRq DFzfnNngsCdxGD+jTmuEY8Qy79TSkJPTJGIqtJ5vtJopCpU+369X67v1Sgp19VVQXxMDcfxkcBBZ aSRHAtv1cYfep+UhLUoZOD1xzG1BfU3IVT0+WufKDp0XYyPvVstVSWB0VmdnDmPqDjtH4gT5CsrL i09gv4URHr0uYL0B/fGiR7DuVU/xzl+oyWzkI+P6gPq8pwyXrbSmAnw5qXwHv9ol6ufhb38AAAD/ /wMAUEsDBBQABgAIAAAAIQAqDcAs4gAAAA4BAAAPAAAAZHJzL2Rvd25yZXYueG1sTI9PT4NAEMXv Jn6HzZh4MXYpDdhSlqbRePBo28Trlp0Cys4SdinYT+8YD/Uyyfx77/fyzWRbccbeN44UzGcRCKTS mYYqBYf96+MShA+ajG4doYJv9LApbm9ynRk30jued6ESLEI+0wrqELpMSl/WaLWfuQ6JdyfXWx24 7Stpej2yuG1lHEWptLohdqh1h881ll+7wSpAPyTzaLuy1eHtMj58xJfPsdsrdX83vay5bNcgAk7h +gG/GZgfCgY7uoGMF62CRZIyf1AQJykIPlgt4icQx7+BLHL5P0bxAwAA//8DAFBLAQItABQABgAI AAAAIQC2gziS/gAAAOEBAAATAAAAAAAAAAAAAAAAAAAAAABbQ29udGVudF9UeXBlc10ueG1sUEsB Ai0AFAAGAAgAAAAhADj9If/WAAAAlAEAAAsAAAAAAAAAAAAAAAAALwEAAF9yZWxzLy5yZWxzUEsB Ai0AFAAGAAgAAAAhAGLWL42rAQAAQAMAAA4AAAAAAAAAAAAAAAAALgIAAGRycy9lMm9Eb2MueG1s UEsBAi0AFAAGAAgAAAAhACoNwCziAAAADgEAAA8AAAAAAAAAAAAAAAAABQQAAGRycy9kb3ducmV2 LnhtbFBLBQYAAAAABAAEAPMAAAAUBQAAAAA= ">
                 <o:lock v:ext="edit" shapetype="f"/>
               </v:shape>
             </w:pict>
@@ -250,7 +250,7 @@
         </w:rPr>
         <w:tab/>
         <w:tab/>
-        <w:t xml:space="preserve">    </w:t>
+        <w:t xml:space="preserve">             </w:t>
       </w:r>
       <w:r>
         <w:rPr>
@@ -393,12 +393,12 @@
               <wp:anchor distT="4294967294" distB="4294967294" distL="114300" distR="114300" simplePos="0" relativeHeight="251657216" behindDoc="0" locked="0" layoutInCell="1" allowOverlap="1" wp14:anchorId="3F3431EB" wp14:editId="506BD878">
                 <wp:simplePos x="0" y="0"/>
                 <wp:positionH relativeFrom="column">
-                  <wp:posOffset>2375680</wp:posOffset>
+                  <wp:posOffset>2265680</wp:posOffset>
                 </wp:positionH>
                 <wp:positionV relativeFrom="paragraph">
                   <wp:posOffset>189229</wp:posOffset>
                 </wp:positionV>
-                <wp:extent cx="3546965" cy="0"/>
+                <wp:extent cx="3656965" cy="0"/>
                 <wp:effectExtent l="0" t="0" r="635" b="0"/>
                 <wp:wrapNone/>
                 <wp:docPr id="15" name="Straight Arrow Connector 15"/>
@@ -414,7 +414,7 @@
                       <wps:spPr bwMode="auto">
                         <a:xfrm>
                           <a:off x="0" y="0"/>
-                          <a:ext cx="3546965" cy="0"/>
+                          <a:ext cx="3656965" cy="0"/>
                         </a:xfrm>
                         <a:prstGeom prst="straightConnector1">
                           <a:avLst/>
@@ -444,7 +444,7 @@
           </mc:Choice>
           <mc:Fallback xmlns:oel="http://schemas.microsoft.com/office/2019/extlst">
             <w:pict>
-              <v:shape w14:anchorId="1998D8ED" id="Straight Arrow Connector 15" o:spid="_x0000_s1026" type="#_x0000_t32" style="position:absolute;margin-left:187.1pt;margin-top:14.9pt;width:279.3pt;height:0;z-index:251657216;visibility:visible;mso-wrap-style:square;mso-width-percent:0;mso-height-percent:0;mso-wrap-distance-left:9pt;mso-wrap-distance-top:.mm;mso-wrap-distance-right:9pt;mso-wrap-distance-bottom:.mm;mso-position-horizontal:absolute;mso-position-horizontal-relative:text;mso-position-vertical:absolute;mso-position-vertical-relative:text;mso-width-percent:0;mso-height-percent:0;mso-width-relative:page;mso-height-relative:page" o:gfxdata="UEsDBBQABgAIAAAAIQC2gziS/gAAAOEBAAATAAAAW0NvbnRlbnRfVHlwZXNdLnhtbJSRQU7DMBBF 90jcwfIWJU67QAgl6YK0S0CoHGBkTxKLZGx5TGhvj5O2G0SRWNoz/78nu9wcxkFMGNg6quQqL6RA 0s5Y6ir5vt9lD1JwBDIwOMJKHpHlpr69KfdHjyxSmriSfYz+USnWPY7AufNIadK6MEJMx9ApD/oD OlTrorhX2lFEilmcO2RdNtjC5xDF9pCuTyYBB5bi6bQ4syoJ3g9WQ0ymaiLzg5KdCXlKLjvcW893 SUOqXwnz5DrgnHtJTxOsQfEKIT7DmDSUCaxw7Rqn8787ZsmRM9e2VmPeBN4uqYvTtW7jvijg9N/y JsXecLq0q+WD6m8AAAD//wMAUEsDBBQABgAIAAAAIQA4/SH/1gAAAJQBAAALAAAAX3JlbHMvLnJl bHOkkMFqwzAMhu+DvYPRfXGawxijTi+j0GvpHsDYimMaW0Yy2fr2M4PBMnrbUb/Q94l/f/hMi1qR JVI2sOt6UJgd+ZiDgffL8ekFlFSbvV0oo4EbChzGx4f9GRdb25HMsYhqlCwG5lrLq9biZkxWOiqY 22YiTra2kYMu1l1tQD30/bPm3wwYN0x18gb45AdQl1tp5j/sFB2T0FQ7R0nTNEV3j6o9feQzro1i OWA14Fm+Q8a1a8+Bvu/d/dMb2JY5uiPbhG/ktn4cqGU/er3pcvwCAAD//wMAUEsDBBQABgAIAAAA IQBi1i+NqwEAAEADAAAOAAAAZHJzL2Uyb0RvYy54bWysUs1u2zAMvg/YOwi6L04yJFiNOD2k6y7d FqDdAzCSbAuTRYFUYuftJ6lJ9ncbpgNBiuRH8iM399PgxMkQW/SNXMzmUhivUFvfNfLby+O7D1Jw BK/BoTeNPBuW99u3bzZjqM0Se3TakEggnusxNLKPMdRVxao3A/AMg/HJ2SINEJNJXaUJxoQ+uGo5 n6+rEUkHQmWY0+/Dq1NuC37bGhW/ti2bKFwjU2+xSCrykGW13UDdEYTeqksb8A9dDGB9KnqDeoAI 4kj2L6jBKkLGNs4UDhW2rVWmzJCmWcz/mOa5h2DKLIkcDjea+P/Bqi+nnd9Tbl1N/jk8ofrOiZRq DFzfnNngsCdxGD+jTmuEY8Qy79TSkJPTJGIqtJ5vtJopCpU+369X67v1Sgp19VVQXxMDcfxkcBBZ aSRHAtv1cYfep+UhLUoZOD1xzG1BfU3IVT0+WufKDp0XYyPvVstVSWB0VmdnDmPqDjtH4gT5CsrL i09gv4URHr0uYL0B/fGiR7DuVU/xzl+oyWzkI+P6gPq8pwyXrbSmAnw5qXwHv9ol6ufhb38AAAD/ /wMAUEsDBBQABgAIAAAAIQBEmx5g4gAAAA4BAAAPAAAAZHJzL2Rvd25yZXYueG1sTI9NT8JAEIbv JvyHzZBwMbKlBLSlW0IwHjwKJF6X7thWu7NNd0srv94xHvAyk/l653mz7WgbccHO144ULOYRCKTC mZpKBafjy8MTCB80Gd04QgXf6GGbT+4ynRo30BteDqEULEI+1QqqENpUSl9UaLWfuxaJZx+uszpw 2ZXSdHpgcdvIOIrW0uqa+EOlW9xXWHwdeqsAfb9aRLvElqfX63D/Hl8/h/ao1Gw6Pm847DYgAo7h dgG/HpgfcgY7u56MF42C5WrN/EFBnHDmhWQZP4I4/zVknsn/NvIfAAAA//8DAFBLAQItABQABgAI AAAAIQC2gziS/gAAAOEBAAATAAAAAAAAAAAAAAAAAAAAAABbQ29udGVudF9UeXBlc10ueG1sUEsB Ai0AFAAGAAgAAAAhADj9If/WAAAAlAEAAAsAAAAAAAAAAAAAAAAALwEAAF9yZWxzLy5yZWxzUEsB Ai0AFAAGAAgAAAAhAGLWL42rAQAAQAMAAA4AAAAAAAAAAAAAAAAALgIAAGRycy9lMm9Eb2MueG1s UEsBAi0AFAAGAAgAAAAhAESbHmDiAAAADgEAAA8AAAAAAAAAAAAAAAAABQQAAGRycy9kb3ducmV2 LnhtbFBLBQYAAAAABAAEAPMAAAAUBQAAAAA= ">
+              <v:shape w14:anchorId="1998D8ED" id="Straight Arrow Connector 15" o:spid="_x0000_s1026" type="#_x0000_t32" style="position:absolute;margin-left:178.4pt;margin-top:14.9pt;width:287.95pt;height:0;z-index:251657216;visibility:visible;mso-wrap-style:square;mso-width-percent:0;mso-height-percent:0;mso-wrap-distance-left:9pt;mso-wrap-distance-top:.mm;mso-wrap-distance-right:9pt;mso-wrap-distance-bottom:.mm;mso-position-horizontal:absolute;mso-position-horizontal-relative:text;mso-position-vertical:absolute;mso-position-vertical-relative:text;mso-width-percent:0;mso-height-percent:0;mso-width-relative:page;mso-height-relative:page" o:gfxdata="UEsDBBQABgAIAAAAIQC2gziS/gAAAOEBAAATAAAAW0NvbnRlbnRfVHlwZXNdLnhtbJSRQU7DMBBF 90jcwfIWJU67QAgl6YK0S0CoHGBkTxKLZGx5TGhvj5O2G0SRWNoz/78nu9wcxkFMGNg6quQqL6RA 0s5Y6ir5vt9lD1JwBDIwOMJKHpHlpr69KfdHjyxSmriSfYz+USnWPY7AufNIadK6MEJMx9ApD/oD OlTrorhX2lFEilmcO2RdNtjC5xDF9pCuTyYBB5bi6bQ4syoJ3g9WQ0ymaiLzg5KdCXlKLjvcW893 SUOqXwnz5DrgnHtJTxOsQfEKIT7DmDSUCaxw7Rqn8787ZsmRM9e2VmPeBN4uqYvTtW7jvijg9N/y JsXecLq0q+WD6m8AAAD//wMAUEsDBBQABgAIAAAAIQA4/SH/1gAAAJQBAAALAAAAX3JlbHMvLnJl bHOkkMFqwzAMhu+DvYPRfXGawxijTi+j0GvpHsDYimMaW0Yy2fr2M4PBMnrbUb/Q94l/f/hMi1qR JVI2sOt6UJgd+ZiDgffL8ekFlFSbvV0oo4EbChzGx4f9GRdb25HMsYhqlCwG5lrLq9biZkxWOiqY 22YiTra2kYMu1l1tQD30/bPm3wwYN0x18gb45AdQl1tp5j/sFB2T0FQ7R0nTNEV3j6o9feQzro1i OWA14Fm+Q8a1a8+Bvu/d/dMb2JY5uiPbhG/ktn4cqGU/er3pcvwCAAD//wMAUEsDBBQABgAIAAAA IQBi1i+NqwEAAEADAAAOAAAAZHJzL2Uyb0RvYy54bWysUs1u2zAMvg/YOwi6L04yJFiNOD2k6y7d FqDdAzCSbAuTRYFUYuftJ6lJ9ncbpgNBiuRH8iM399PgxMkQW/SNXMzmUhivUFvfNfLby+O7D1Jw BK/BoTeNPBuW99u3bzZjqM0Se3TakEggnusxNLKPMdRVxao3A/AMg/HJ2SINEJNJXaUJxoQ+uGo5 n6+rEUkHQmWY0+/Dq1NuC37bGhW/ti2bKFwjU2+xSCrykGW13UDdEYTeqksb8A9dDGB9KnqDeoAI 4kj2L6jBKkLGNs4UDhW2rVWmzJCmWcz/mOa5h2DKLIkcDjea+P/Bqi+nnd9Tbl1N/jk8ofrOiZRq DFzfnNngsCdxGD+jTmuEY8Qy79TSkJPTJGIqtJ5vtJopCpU+369X67v1Sgp19VVQXxMDcfxkcBBZ aSRHAtv1cYfep+UhLUoZOD1xzG1BfU3IVT0+WufKDp0XYyPvVstVSWB0VmdnDmPqDjtH4gT5CsrL i09gv4URHr0uYL0B/fGiR7DuVU/xzl+oyWzkI+P6gPq8pwyXrbSmAnw5qXwHv9ol6ufhb38AAAD/ /wMAUEsDBBQABgAIAAAAIQBEmx5g4gAAAA4BAAAPAAAAZHJzL2Rvd25yZXYueG1sTI9NT8JAEIbv JvyHzZBwMbKlBLSlW0IwHjwKJF6X7thWu7NNd0srv94xHvAyk/l653mz7WgbccHO144ULOYRCKTC mZpKBafjy8MTCB80Gd04QgXf6GGbT+4ynRo30BteDqEULEI+1QqqENpUSl9UaLWfuxaJZx+uszpw 2ZXSdHpgcdvIOIrW0uqa+EOlW9xXWHwdeqsAfb9aRLvElqfX63D/Hl8/h/ao1Gw6Pm847DYgAo7h dgG/HpgfcgY7u56MF42C5WrN/EFBnHDmhWQZP4I4/zVknsn/NvIfAAAA//8DAFBLAQItABQABgAI AAAAIQC2gziS/gAAAOEBAAATAAAAAAAAAAAAAAAAAAAAAABbQ29udGVudF9UeXBlc10ueG1sUEsB Ai0AFAAGAAgAAAAhADj9If/WAAAAlAEAAAsAAAAAAAAAAAAAAAAALwEAAF9yZWxzLy5yZWxzUEsB Ai0AFAAGAAgAAAAhAGLWL42rAQAAQAMAAA4AAAAAAAAAAAAAAAAALgIAAGRycy9lMm9Eb2MueG1s UEsBAi0AFAAGAAgAAAAhAESbHmDiAAAADgEAAA8AAAAAAAAAAAAAAAAABQQAAGRycy9kb3ducmV2 LnhtbFBLBQYAAAAABAAEAPMAAAAUBQAAAAA= ">
                 <o:lock v:ext="edit" shapetype="f"/>
               </v:shape>
             </w:pict>
@@ -467,7 +467,7 @@
         <w:tab/>
         <w:tab/>
         <w:tab/>
-        <w:t xml:space="preserve">    </w:t>
+        <w:t xml:space="preserve">             </w:t>
       </w:r>
       <w:r>
         <w:rPr>
@@ -591,12 +591,12 @@
               <wp:anchor distT="4294967294" distB="4294967294" distL="114300" distR="114300" simplePos="0" relativeHeight="251658240" behindDoc="0" locked="0" layoutInCell="1" allowOverlap="1" wp14:anchorId="545C4D35" wp14:editId="740ACD62">
                 <wp:simplePos x="0" y="0"/>
                 <wp:positionH relativeFrom="column">
-                  <wp:posOffset>2375680</wp:posOffset>
+                  <wp:posOffset>2265680</wp:posOffset>
                 </wp:positionH>
                 <wp:positionV relativeFrom="paragraph">
                   <wp:posOffset>187324</wp:posOffset>
                 </wp:positionV>
-                <wp:extent cx="3546965" cy="0"/>
+                <wp:extent cx="3656965" cy="0"/>
                 <wp:effectExtent l="0" t="0" r="635" b="0"/>
                 <wp:wrapNone/>
                 <wp:docPr id="14" name="Straight Arrow Connector 14"/>
@@ -612,7 +612,7 @@
                       <wps:spPr bwMode="auto">
                         <a:xfrm>
                           <a:off x="0" y="0"/>
-                          <a:ext cx="3546965" cy="0"/>
+                          <a:ext cx="3656965" cy="0"/>
                         </a:xfrm>
                         <a:prstGeom prst="straightConnector1">
                           <a:avLst/>
@@ -642,7 +642,7 @@
           </mc:Choice>
           <mc:Fallback xmlns:oel="http://schemas.microsoft.com/office/2019/extlst">
             <w:pict>
-              <v:shape w14:anchorId="2F36D47E" id="Straight Arrow Connector 14" o:spid="_x0000_s1026" type="#_x0000_t32" style="position:absolute;margin-left:187.1pt;margin-top:14.75pt;width:279.3pt;height:0;z-index:251658240;visibility:visible;mso-wrap-style:square;mso-width-percent:0;mso-height-percent:0;mso-wrap-distance-left:9pt;mso-wrap-distance-top:.mm;mso-wrap-distance-right:9pt;mso-wrap-distance-bottom:.mm;mso-position-horizontal:absolute;mso-position-horizontal-relative:text;mso-position-vertical:absolute;mso-position-vertical-relative:text;mso-width-percent:0;mso-height-percent:0;mso-width-relative:page;mso-height-relative:page" o:gfxdata="UEsDBBQABgAIAAAAIQC2gziS/gAAAOEBAAATAAAAW0NvbnRlbnRfVHlwZXNdLnhtbJSRQU7DMBBF 90jcwfIWJU67QAgl6YK0S0CoHGBkTxKLZGx5TGhvj5O2G0SRWNoz/78nu9wcxkFMGNg6quQqL6RA 0s5Y6ir5vt9lD1JwBDIwOMJKHpHlpr69KfdHjyxSmriSfYz+USnWPY7AufNIadK6MEJMx9ApD/oD OlTrorhX2lFEilmcO2RdNtjC5xDF9pCuTyYBB5bi6bQ4syoJ3g9WQ0ymaiLzg5KdCXlKLjvcW893 SUOqXwnz5DrgnHtJTxOsQfEKIT7DmDSUCaxw7Rqn8787ZsmRM9e2VmPeBN4uqYvTtW7jvijg9N/y JsXecLq0q+WD6m8AAAD//wMAUEsDBBQABgAIAAAAIQA4/SH/1gAAAJQBAAALAAAAX3JlbHMvLnJl bHOkkMFqwzAMhu+DvYPRfXGawxijTi+j0GvpHsDYimMaW0Yy2fr2M4PBMnrbUb/Q94l/f/hMi1qR JVI2sOt6UJgd+ZiDgffL8ekFlFSbvV0oo4EbChzGx4f9GRdb25HMsYhqlCwG5lrLq9biZkxWOiqY 22YiTra2kYMu1l1tQD30/bPm3wwYN0x18gb45AdQl1tp5j/sFB2T0FQ7R0nTNEV3j6o9feQzro1i OWA14Fm+Q8a1a8+Bvu/d/dMb2JY5uiPbhG/ktn4cqGU/er3pcvwCAAD//wMAUEsDBBQABgAIAAAA IQBi1i+NqwEAAEADAAAOAAAAZHJzL2Uyb0RvYy54bWysUs1u2zAMvg/YOwi6L04yJFiNOD2k6y7d FqDdAzCSbAuTRYFUYuftJ6lJ9ncbpgNBiuRH8iM399PgxMkQW/SNXMzmUhivUFvfNfLby+O7D1Jw BK/BoTeNPBuW99u3bzZjqM0Se3TakEggnusxNLKPMdRVxao3A/AMg/HJ2SINEJNJXaUJxoQ+uGo5 n6+rEUkHQmWY0+/Dq1NuC37bGhW/ti2bKFwjU2+xSCrykGW13UDdEYTeqksb8A9dDGB9KnqDeoAI 4kj2L6jBKkLGNs4UDhW2rVWmzJCmWcz/mOa5h2DKLIkcDjea+P/Bqi+nnd9Tbl1N/jk8ofrOiZRq DFzfnNngsCdxGD+jTmuEY8Qy79TSkJPTJGIqtJ5vtJopCpU+369X67v1Sgp19VVQXxMDcfxkcBBZ aSRHAtv1cYfep+UhLUoZOD1xzG1BfU3IVT0+WufKDp0XYyPvVstVSWB0VmdnDmPqDjtH4gT5CsrL i09gv4URHr0uYL0B/fGiR7DuVU/xzl+oyWzkI+P6gPq8pwyXrbSmAnw5qXwHv9ol6ufhb38AAAD/ /wMAUEsDBBQABgAIAAAAIQBXNrWK4gAAAA4BAAAPAAAAZHJzL2Rvd25yZXYueG1sTI9PT4NAEMXv Jn6HzZh4MXYpDbVQlqbRePBo28Trlp0Cys4SdinYT+8YD/Uyyfx77/fyzWRbccbeN44UzGcRCKTS mYYqBYf96+MKhA+ajG4doYJv9LApbm9ynRk30jued6ESLEI+0wrqELpMSl/WaLWfuQ6JdyfXWx24 7Stpej2yuG1lHEVLaXVD7FDrDp9rLL92g1WAfkjm0Ta11eHtMj58xJfPsdsrdX83vay5bNcgAk7h +gG/GZgfCgY7uoGMF62CRbJk/qAgThMQfJAu4icQx7+BLHL5P0bxAwAA//8DAFBLAQItABQABgAI AAAAIQC2gziS/gAAAOEBAAATAAAAAAAAAAAAAAAAAAAAAABbQ29udGVudF9UeXBlc10ueG1sUEsB Ai0AFAAGAAgAAAAhADj9If/WAAAAlAEAAAsAAAAAAAAAAAAAAAAALwEAAF9yZWxzLy5yZWxzUEsB Ai0AFAAGAAgAAAAhAGLWL42rAQAAQAMAAA4AAAAAAAAAAAAAAAAALgIAAGRycy9lMm9Eb2MueG1s UEsBAi0AFAAGAAgAAAAhAFc2tYriAAAADgEAAA8AAAAAAAAAAAAAAAAABQQAAGRycy9kb3ducmV2 LnhtbFBLBQYAAAAABAAEAPMAAAAUBQAAAAA= ">
+              <v:shape w14:anchorId="2F36D47E" id="Straight Arrow Connector 14" o:spid="_x0000_s1026" type="#_x0000_t32" style="position:absolute;margin-left:178.4pt;margin-top:14.75pt;width:287.95pt;height:0;z-index:251658240;visibility:visible;mso-wrap-style:square;mso-width-percent:0;mso-height-percent:0;mso-wrap-distance-left:9pt;mso-wrap-distance-top:.mm;mso-wrap-distance-right:9pt;mso-wrap-distance-bottom:.mm;mso-position-horizontal:absolute;mso-position-horizontal-relative:text;mso-position-vertical:absolute;mso-position-vertical-relative:text;mso-width-percent:0;mso-height-percent:0;mso-width-relative:page;mso-height-relative:page" o:gfxdata="UEsDBBQABgAIAAAAIQC2gziS/gAAAOEBAAATAAAAW0NvbnRlbnRfVHlwZXNdLnhtbJSRQU7DMBBF 90jcwfIWJU67QAgl6YK0S0CoHGBkTxKLZGx5TGhvj5O2G0SRWNoz/78nu9wcxkFMGNg6quQqL6RA 0s5Y6ir5vt9lD1JwBDIwOMJKHpHlpr69KfdHjyxSmriSfYz+USnWPY7AufNIadK6MEJMx9ApD/oD OlTrorhX2lFEilmcO2RdNtjC5xDF9pCuTyYBB5bi6bQ4syoJ3g9WQ0ymaiLzg5KdCXlKLjvcW893 SUOqXwnz5DrgnHtJTxOsQfEKIT7DmDSUCaxw7Rqn8787ZsmRM9e2VmPeBN4uqYvTtW7jvijg9N/y JsXecLq0q+WD6m8AAAD//wMAUEsDBBQABgAIAAAAIQA4/SH/1gAAAJQBAAALAAAAX3JlbHMvLnJl bHOkkMFqwzAMhu+DvYPRfXGawxijTi+j0GvpHsDYimMaW0Yy2fr2M4PBMnrbUb/Q94l/f/hMi1qR JVI2sOt6UJgd+ZiDgffL8ekFlFSbvV0oo4EbChzGx4f9GRdb25HMsYhqlCwG5lrLq9biZkxWOiqY 22YiTra2kYMu1l1tQD30/bPm3wwYN0x18gb45AdQl1tp5j/sFB2T0FQ7R0nTNEV3j6o9feQzro1i OWA14Fm+Q8a1a8+Bvu/d/dMb2JY5uiPbhG/ktn4cqGU/er3pcvwCAAD//wMAUEsDBBQABgAIAAAA IQBi1i+NqwEAAEADAAAOAAAAZHJzL2Uyb0RvYy54bWysUs1u2zAMvg/YOwi6L04yJFiNOD2k6y7d FqDdAzCSbAuTRYFUYuftJ6lJ9ncbpgNBiuRH8iM399PgxMkQW/SNXMzmUhivUFvfNfLby+O7D1Jw BK/BoTeNPBuW99u3bzZjqM0Se3TakEggnusxNLKPMdRVxao3A/AMg/HJ2SINEJNJXaUJxoQ+uGo5 n6+rEUkHQmWY0+/Dq1NuC37bGhW/ti2bKFwjU2+xSCrykGW13UDdEYTeqksb8A9dDGB9KnqDeoAI 4kj2L6jBKkLGNs4UDhW2rVWmzJCmWcz/mOa5h2DKLIkcDjea+P/Bqi+nnd9Tbl1N/jk8ofrOiZRq DFzfnNngsCdxGD+jTmuEY8Qy79TSkJPTJGIqtJ5vtJopCpU+369X67v1Sgp19VVQXxMDcfxkcBBZ aSRHAtv1cYfep+UhLUoZOD1xzG1BfU3IVT0+WufKDp0XYyPvVstVSWB0VmdnDmPqDjtH4gT5CsrL i09gv4URHr0uYL0B/fGiR7DuVU/xzl+oyWzkI+P6gPq8pwyXrbSmAnw5qXwHv9ol6ufhb38AAAD/ /wMAUEsDBBQABgAIAAAAIQBXNrWK4gAAAA4BAAAPAAAAZHJzL2Rvd25yZXYueG1sTI9PT4NAEMXv Jn6HzZh4MXYpDbVQlqbRePBo28Trlp0Cys4SdinYT+8YD/Uyyfx77/fyzWRbccbeN44UzGcRCKTS mYYqBYf96+MKhA+ajG4doYJv9LApbm9ynRk30jued6ESLEI+0wrqELpMSl/WaLWfuQ6JdyfXWx24 7Stpej2yuG1lHEVLaXVD7FDrDp9rLL92g1WAfkjm0Ta11eHtMj58xJfPsdsrdX83vay5bNcgAk7h +gG/GZgfCgY7uoGMF62CRbJk/qAgThMQfJAu4icQx7+BLHL5P0bxAwAA//8DAFBLAQItABQABgAI AAAAIQC2gziS/gAAAOEBAAATAAAAAAAAAAAAAAAAAAAAAABbQ29udGVudF9UeXBlc10ueG1sUEsB Ai0AFAAGAAgAAAAhADj9If/WAAAAlAEAAAsAAAAAAAAAAAAAAAAALwEAAF9yZWxzLy5yZWxzUEsB Ai0AFAAGAAgAAAAhAGLWL42rAQAAQAMAAA4AAAAAAAAAAAAAAAAALgIAAGRycy9lMm9Eb2MueG1s UEsBAi0AFAAGAAgAAAAhAFc2tYriAAAADgEAAA8AAAAAAAAAAAAAAAAABQQAAGRycy9kb3ducmV2 LnhtbFBLBQYAAAAABAAEAPMAAAAUBQAAAAA= ">
                 <o:lock v:ext="edit" shapetype="f"/>
               </v:shape>
             </w:pict>
@@ -664,7 +664,7 @@
         </w:rPr>
         <w:tab/>
         <w:tab/>
-        <w:t xml:space="preserve">    </w:t>
+        <w:t xml:space="preserve">             </w:t>
       </w:r>
       <w:r>
         <w:rPr>
@@ -1442,6 +1442,44 @@
         </w:rPr>
         <w:t xml:space="preserve">Date </w:t>
       </w:r>
+    </w:p>
+    <w:p>
+      <w:pPr>
+        <w:pStyle w:val="NoSpacing"/>
+        <w:pBdr>
+          <w:top w:val="single" w:sz="4" w:space="1" w:color="auto"/>
+          <w:left w:val="single" w:sz="4" w:space="4" w:color="auto"/>
+          <w:bottom w:val="single" w:sz="4" w:space="1" w:color="auto"/>
+          <w:right w:val="single" w:sz="4" w:space="4" w:color="auto"/>
+        </w:pBdr>
+        <w:tabs>
+          <w:tab w:val="left" w:pos="720"/>
+          <w:tab w:val="left" w:pos="3690"/>
+        </w:tabs>
+        <w:spacing w:line="276" w:lineRule="auto"/>
+        <w:rPr>
+          <w:bCs/>
+          <w:noProof/>
+          <w:sz w:val="24"/>
+          <w:szCs w:val="24"/>
+        </w:rPr>
+      </w:pPr>
+      <w:r>
+        <w:rPr>
+          <w:b/>
+          <w:sz w:val="24"/>
+          <w:szCs w:val="24"/>
+        </w:rPr>
+        <w:tab/>
+      </w:r>
+      <w:r>
+        <w:rPr>
+          <w:b/>
+          <w:sz w:val="24"/>
+          <w:szCs w:val="24"/>
+        </w:rPr>
+        <w:tab/>
+      </w:r>
       <w:sdt>
         <w:sdtPr>
           <w:rPr>
@@ -1451,7 +1489,7 @@
           </w:rPr>
           <w:alias w:val="Date"/>
           <w:tag w:val="Date"/>
-          <w:id w:val="-995719161"/>
+          <w:id w:val="-995719162"/>
           <w:placeholder>
             <w:docPart w:val="67FE843B0FE14282A10486D040037D52"/>
           </w:placeholder>
@@ -2384,6 +2422,7 @@
         </w:sectPr>
       </w:pPr>
     </w:p>
+    <w:p/>
     <w:tbl>
       <w:tblPr>
         <w:tblStyle w:val="TableGrid"/>

</xml_diff>